<commit_message>
Added the project document
</commit_message>
<xml_diff>
--- a/docs/Heart_Disease_RF_1-2.docx
+++ b/docs/Heart_Disease_RF_1-2.docx
@@ -41,7 +41,7 @@
     <w:p>
       <w:pPr>
         <w:spacing w:after="2000"/>
-        <w:jc w:val="both"/>
+        <w:jc w:val="center"/>
         <w:rPr>
           <w:rFonts w:hint="default" w:ascii="Times New Roman" w:hAnsi="Times New Roman" w:cs="Times New Roman"/>
           <w:b/>
@@ -50,6 +50,64 @@
           <w:szCs w:val="28"/>
         </w:rPr>
       </w:pPr>
+    </w:p>
+    <w:p>
+      <w:pPr>
+        <w:spacing w:after="200"/>
+        <w:jc w:val="center"/>
+        <w:rPr>
+          <w:rFonts w:hint="default" w:ascii="Times New Roman" w:hAnsi="Times New Roman" w:cs="Times New Roman"/>
+          <w:b/>
+          <w:bCs/>
+          <w:sz w:val="28"/>
+          <w:szCs w:val="28"/>
+        </w:rPr>
+      </w:pPr>
+      <w:r>
+        <w:rPr>
+          <w:rFonts w:hint="default" w:ascii="Times New Roman" w:hAnsi="Times New Roman" w:cs="Times New Roman"/>
+          <w:b/>
+          <w:bCs/>
+          <w:sz w:val="28"/>
+          <w:szCs w:val="28"/>
+        </w:rPr>
+        <w:t>B</w:t>
+      </w:r>
+      <w:r>
+        <w:rPr>
+          <w:rFonts w:hint="default" w:ascii="Times New Roman" w:hAnsi="Times New Roman" w:cs="Times New Roman"/>
+          <w:b/>
+          <w:bCs/>
+          <w:sz w:val="28"/>
+          <w:szCs w:val="28"/>
+          <w:lang w:val="en-US"/>
+        </w:rPr>
+        <w:t>Y</w:t>
+      </w:r>
+    </w:p>
+    <w:p>
+      <w:pPr>
+        <w:spacing w:after="2000"/>
+        <w:jc w:val="center"/>
+        <w:rPr>
+          <w:rFonts w:hint="default" w:ascii="Times New Roman" w:hAnsi="Times New Roman" w:cs="Times New Roman"/>
+          <w:b/>
+          <w:bCs/>
+          <w:sz w:val="28"/>
+          <w:szCs w:val="28"/>
+        </w:rPr>
+      </w:pPr>
+      <w:r>
+        <w:rPr>
+          <w:rFonts w:hint="default" w:ascii="Times New Roman" w:hAnsi="Times New Roman" w:cs="Times New Roman"/>
+          <w:b/>
+          <w:bCs/>
+          <w:sz w:val="28"/>
+          <w:szCs w:val="28"/>
+          <w:lang w:val="en-US"/>
+        </w:rPr>
+        <w:t>KAASHACHIA JESSE TERWASE</w:t>
+      </w:r>
     </w:p>
     <w:p>
       <w:pPr>
@@ -177,18 +235,6 @@
         </w:rPr>
         <w:t>SCIENCE</w:t>
       </w:r>
-    </w:p>
-    <w:p>
-      <w:pPr>
-        <w:jc w:val="center"/>
-        <w:rPr>
-          <w:rFonts w:hint="default" w:ascii="Times New Roman" w:hAnsi="Times New Roman" w:cs="Times New Roman"/>
-          <w:b/>
-          <w:bCs/>
-          <w:sz w:val="28"/>
-          <w:szCs w:val="28"/>
-        </w:rPr>
-      </w:pPr>
     </w:p>
     <w:p>
       <w:pPr>
@@ -506,7 +552,26 @@
           <w:sz w:val="24"/>
           <w:szCs w:val="24"/>
         </w:rPr>
-        <w:t>Despite these findings, there remains a need for further studies that systematically develop and evaluate Random Forest models using established clinical datasets. In particular, a well-defined modelling process involving data preprocessing, model development, hyperparameter optimisation, performance evaluation, and analysis of the attributes contributing to predictions can provide a clearer understanding of the algorithm's effectiveness for heart disease diagnosis. Establishing such a process is also important for ensuring that the resulting model is appropriately evaluated and that its predictive performance can be compared with findings from previous studies.</w:t>
+        <w:t>Despite these findings, there remains a need for further studies that systematically develop and evaluate Random Forest models using established clinical datasets. In particular, a well-defined modelling process involving data preprocessing, model development, hyperparameter optimisation, performance evaluation, and analysis of the attributes contributing to predictions can provide a clearer understanding of the algorithm</w:t>
+      </w:r>
+      <w:r>
+        <w:rPr>
+          <w:rFonts w:hint="default" w:ascii="Times New Roman" w:hAnsi="Times New Roman" w:cs="Times New Roman"/>
+          <w:color w:val="auto"/>
+          <w:sz w:val="24"/>
+          <w:szCs w:val="24"/>
+          <w:lang w:val="en-US"/>
+        </w:rPr>
+        <w:t>’</w:t>
+      </w:r>
+      <w:r>
+        <w:rPr>
+          <w:rFonts w:hint="default" w:ascii="Times New Roman" w:hAnsi="Times New Roman" w:cs="Times New Roman"/>
+          <w:color w:val="auto"/>
+          <w:sz w:val="24"/>
+          <w:szCs w:val="24"/>
+        </w:rPr>
+        <w:t>s effectiveness for heart disease diagnosis. Establishing such a process is also important for ensuring that the resulting model is appropriately evaluated and that its predictive performance can be compared with findings from previous studies.</w:t>
       </w:r>
     </w:p>
     <w:p>
@@ -2933,8 +2998,777 @@
         </w:rPr>
         <w:t>The harmonic mean of precision and recall, providing a combined measure of these two classification performance metrics.</w:t>
       </w:r>
-      <w:bookmarkStart w:id="8" w:name="_GoBack"/>
+    </w:p>
+    <w:p>
+      <w:pPr>
+        <w:pStyle w:val="22"/>
+        <w:keepNext w:val="0"/>
+        <w:keepLines w:val="0"/>
+        <w:pageBreakBefore w:val="0"/>
+        <w:widowControl/>
+        <w:numPr>
+          <w:numId w:val="0"/>
+        </w:numPr>
+        <w:kinsoku/>
+        <w:wordWrap/>
+        <w:overflowPunct/>
+        <w:topLinePunct w:val="0"/>
+        <w:autoSpaceDE/>
+        <w:autoSpaceDN/>
+        <w:bidi w:val="0"/>
+        <w:adjustRightInd/>
+        <w:snapToGrid/>
+        <w:spacing w:line="480" w:lineRule="auto"/>
+        <w:jc w:val="both"/>
+        <w:textAlignment w:val="auto"/>
+        <w:rPr>
+          <w:rFonts w:hint="default" w:ascii="Times New Roman" w:hAnsi="Times New Roman" w:cs="Times New Roman"/>
+          <w:b w:val="0"/>
+          <w:bCs w:val="0"/>
+          <w:color w:val="auto"/>
+          <w:sz w:val="24"/>
+          <w:szCs w:val="24"/>
+        </w:rPr>
+      </w:pPr>
+    </w:p>
+    <w:p>
+      <w:pPr>
+        <w:rPr>
+          <w:rFonts w:hint="default" w:ascii="Times New Roman" w:hAnsi="Times New Roman" w:cs="Times New Roman"/>
+          <w:b w:val="0"/>
+          <w:bCs w:val="0"/>
+          <w:color w:val="auto"/>
+          <w:sz w:val="24"/>
+          <w:szCs w:val="24"/>
+        </w:rPr>
+      </w:pPr>
+      <w:r>
+        <w:rPr>
+          <w:rFonts w:hint="default" w:ascii="Times New Roman" w:hAnsi="Times New Roman" w:cs="Times New Roman"/>
+          <w:b w:val="0"/>
+          <w:bCs w:val="0"/>
+          <w:color w:val="auto"/>
+          <w:sz w:val="24"/>
+          <w:szCs w:val="24"/>
+        </w:rPr>
+        <w:br w:type="page"/>
+      </w:r>
+    </w:p>
+    <w:p>
+      <w:pPr>
+        <w:pStyle w:val="2"/>
+        <w:bidi w:val="0"/>
+        <w:rPr>
+          <w:rFonts w:hint="default"/>
+        </w:rPr>
+      </w:pPr>
+      <w:bookmarkStart w:id="8" w:name="_Toc8124"/>
+      <w:r>
+        <w:rPr>
+          <w:rFonts w:hint="default"/>
+        </w:rPr>
+        <w:t>CHAPTER TWO</w:t>
+      </w:r>
       <w:bookmarkEnd w:id="8"/>
+    </w:p>
+    <w:p>
+      <w:pPr>
+        <w:pStyle w:val="2"/>
+        <w:keepNext w:val="0"/>
+        <w:keepLines w:val="0"/>
+        <w:pageBreakBefore w:val="0"/>
+        <w:widowControl/>
+        <w:kinsoku/>
+        <w:wordWrap/>
+        <w:overflowPunct/>
+        <w:topLinePunct w:val="0"/>
+        <w:autoSpaceDE/>
+        <w:autoSpaceDN/>
+        <w:bidi w:val="0"/>
+        <w:adjustRightInd/>
+        <w:snapToGrid/>
+        <w:spacing w:before="240" w:after="240"/>
+        <w:jc w:val="center"/>
+        <w:textAlignment w:val="auto"/>
+        <w:rPr>
+          <w:rFonts w:hint="default" w:ascii="Times New Roman" w:hAnsi="Times New Roman" w:cs="Times New Roman"/>
+          <w:b/>
+          <w:bCs/>
+          <w:color w:val="auto"/>
+          <w:sz w:val="24"/>
+          <w:szCs w:val="24"/>
+        </w:rPr>
+      </w:pPr>
+      <w:bookmarkStart w:id="9" w:name="_Toc19110"/>
+      <w:r>
+        <w:rPr>
+          <w:rFonts w:hint="default" w:ascii="Times New Roman" w:hAnsi="Times New Roman" w:cs="Times New Roman"/>
+          <w:b/>
+          <w:bCs/>
+          <w:color w:val="auto"/>
+          <w:sz w:val="24"/>
+          <w:szCs w:val="24"/>
+        </w:rPr>
+        <w:t>LITERATURE REVIEW</w:t>
+      </w:r>
+      <w:bookmarkEnd w:id="9"/>
+    </w:p>
+    <w:p>
+      <w:pPr>
+        <w:pStyle w:val="3"/>
+        <w:bidi w:val="0"/>
+        <w:rPr>
+          <w:rFonts w:hint="default"/>
+        </w:rPr>
+      </w:pPr>
+      <w:bookmarkStart w:id="10" w:name="_Toc23253"/>
+      <w:r>
+        <w:rPr>
+          <w:rFonts w:hint="default"/>
+        </w:rPr>
+        <w:t>2.1 Overview of Heart Disease and Clinical Risk Factors</w:t>
+      </w:r>
+      <w:bookmarkEnd w:id="10"/>
+    </w:p>
+    <w:p>
+      <w:pPr>
+        <w:spacing w:after="200" w:line="480" w:lineRule="auto"/>
+        <w:jc w:val="both"/>
+        <w:rPr>
+          <w:rFonts w:hint="default" w:ascii="Times New Roman" w:hAnsi="Times New Roman" w:cs="Times New Roman"/>
+          <w:color w:val="auto"/>
+          <w:sz w:val="24"/>
+          <w:szCs w:val="24"/>
+        </w:rPr>
+      </w:pPr>
+      <w:r>
+        <w:rPr>
+          <w:rFonts w:hint="default" w:ascii="Times New Roman" w:hAnsi="Times New Roman" w:cs="Times New Roman"/>
+          <w:color w:val="auto"/>
+          <w:sz w:val="24"/>
+          <w:szCs w:val="24"/>
+        </w:rPr>
+        <w:t>Heart disease encompasses a range of conditions affecting the structure and function of the heart, including coronary artery disease, arrhythmias, and heart valve disease. The World Health Organization (2025) identifies unhealthy diet, physical inactivity, tobacco use, and harmful use of alcohol as the most important behavioural risk factors, while clinical risk factors identified in the diagnostic literature include age, sex, chest pain type, resting blood pressure, serum cholesterol, fasting blood sugar, electrocardiographic results, maximum heart rate achieved during exercise, exercise-induced angina, ST depression, the slope of the peak exercise ST segment, the number of major vessels visible on fluoroscopy, and thalassemia status (Detrano et al., 1989). These attributes form the basis of the Cleveland Heart Disease dataset and are the same attributes used in this study.</w:t>
+      </w:r>
+    </w:p>
+    <w:p>
+      <w:pPr>
+        <w:spacing w:after="200" w:line="480" w:lineRule="auto"/>
+        <w:jc w:val="both"/>
+        <w:rPr>
+          <w:rFonts w:hint="default" w:ascii="Times New Roman" w:hAnsi="Times New Roman" w:cs="Times New Roman"/>
+          <w:color w:val="auto"/>
+          <w:sz w:val="24"/>
+          <w:szCs w:val="24"/>
+        </w:rPr>
+      </w:pPr>
+      <w:r>
+        <w:rPr>
+          <w:rFonts w:hint="default" w:ascii="Times New Roman" w:hAnsi="Times New Roman" w:cs="Times New Roman"/>
+          <w:color w:val="auto"/>
+          <w:sz w:val="24"/>
+          <w:szCs w:val="24"/>
+        </w:rPr>
+        <w:t>The scale of the problem underscores the need for improved approaches to heart disease prediction and diagnosi</w:t>
+      </w:r>
+      <w:r>
+        <w:rPr>
+          <w:rFonts w:hint="default" w:ascii="Times New Roman" w:hAnsi="Times New Roman" w:cs="Times New Roman"/>
+          <w:color w:val="auto"/>
+          <w:sz w:val="24"/>
+          <w:szCs w:val="24"/>
+          <w:lang w:val="en-US"/>
+        </w:rPr>
+        <w:t>s</w:t>
+      </w:r>
+      <w:r>
+        <w:rPr>
+          <w:rFonts w:hint="default" w:ascii="Times New Roman" w:hAnsi="Times New Roman" w:cs="Times New Roman"/>
+          <w:color w:val="auto"/>
+          <w:sz w:val="24"/>
+          <w:szCs w:val="24"/>
+        </w:rPr>
+        <w:t>: the World Heart Federation (2023) reports that global deaths due to cardiovascular disease rose from approximately 12.1 million in 1990 to 18.6 million by 2019, and that progress in reducing age-standardised death rates has begun to stall in recent years, particularly in lower-income regions with constrained health expenditure. This pattern is pronounced in sub-Saharan Africa, where Yuyun et al. (2020) found that cardiovascular disease presents earlier in life and with a distinct risk factor profile compared to high-income countries, complicating the direct transfer of diagnostic norms developed elsewhere. In Nigeria specifically, Ojo et al. (2024) modelled hypertension as a leading driver of cardiovascular disease burden at the national level, reinforcing the relevance of predictive approaches that use clinical attributes to support the identification of heart disease.</w:t>
+      </w:r>
+    </w:p>
+    <w:p>
+      <w:pPr>
+        <w:spacing w:after="200" w:line="480" w:lineRule="auto"/>
+        <w:jc w:val="both"/>
+        <w:rPr>
+          <w:rFonts w:hint="default" w:ascii="Times New Roman" w:hAnsi="Times New Roman" w:cs="Times New Roman"/>
+          <w:color w:val="auto"/>
+          <w:sz w:val="24"/>
+          <w:szCs w:val="24"/>
+        </w:rPr>
+      </w:pPr>
+      <w:r>
+        <w:rPr>
+          <w:rFonts w:hint="default" w:ascii="Times New Roman" w:hAnsi="Times New Roman" w:cs="Times New Roman"/>
+          <w:color w:val="auto"/>
+          <w:sz w:val="24"/>
+          <w:szCs w:val="24"/>
+        </w:rPr>
+        <w:t>Two further points about these risk factors matter for how the rest of this study is read. First, the thirteen attributes used here are not an arbitrary convenience sample; they were selected by the original clinical investigators specifically because each carries independent diagnostic value for coronary artery disease (Detrano et al., 1989)</w:t>
+      </w:r>
+      <w:r>
+        <w:rPr>
+          <w:rFonts w:hint="default" w:ascii="Times New Roman" w:hAnsi="Times New Roman" w:cs="Times New Roman"/>
+          <w:color w:val="auto"/>
+          <w:sz w:val="24"/>
+          <w:szCs w:val="24"/>
+          <w:lang w:val="en-US"/>
+        </w:rPr>
+        <w:t>.</w:t>
+      </w:r>
+      <w:r>
+        <w:rPr>
+          <w:rFonts w:hint="default" w:ascii="Times New Roman" w:hAnsi="Times New Roman" w:cs="Times New Roman"/>
+          <w:color w:val="auto"/>
+          <w:sz w:val="24"/>
+          <w:szCs w:val="24"/>
+        </w:rPr>
+        <w:t xml:space="preserve"> The extent to which these attributes contribute to the model's predictions is examined through feature importance analysis in the subsequent chapters. Second, the attributes span both easily obtained measurements (age, sex, resting blood pressure) and attributes that require a clinical test to obtain (thalassemia status, fluoroscopy, exercise stress results), a distinction that becomes relevant in Section 4.6, where the model is shown to rely more heavily on the latter group.</w:t>
+      </w:r>
+    </w:p>
+    <w:p>
+      <w:pPr>
+        <w:pStyle w:val="3"/>
+        <w:bidi w:val="0"/>
+        <w:rPr>
+          <w:rFonts w:hint="default"/>
+        </w:rPr>
+      </w:pPr>
+      <w:bookmarkStart w:id="11" w:name="_Toc15476"/>
+      <w:r>
+        <w:rPr>
+          <w:rFonts w:hint="default"/>
+        </w:rPr>
+        <w:t>2.2 Machine Learning in Medical Diagnosis</w:t>
+      </w:r>
+      <w:bookmarkEnd w:id="11"/>
+    </w:p>
+    <w:p>
+      <w:pPr>
+        <w:spacing w:after="200" w:line="480" w:lineRule="auto"/>
+        <w:jc w:val="both"/>
+        <w:rPr>
+          <w:rFonts w:hint="default" w:ascii="Times New Roman" w:hAnsi="Times New Roman" w:cs="Times New Roman"/>
+          <w:color w:val="auto"/>
+          <w:sz w:val="24"/>
+          <w:szCs w:val="24"/>
+        </w:rPr>
+      </w:pPr>
+      <w:r>
+        <w:rPr>
+          <w:rFonts w:hint="default" w:ascii="Times New Roman" w:hAnsi="Times New Roman" w:cs="Times New Roman"/>
+          <w:color w:val="auto"/>
+          <w:sz w:val="24"/>
+          <w:szCs w:val="24"/>
+        </w:rPr>
+        <w:t>Machine learning has been applied extensively to medical diagnosis because it can uncover patterns across many variables simultaneously, something that is difficult to do manually, particularly as the number of clinical attributes grows. Supervised learning algorithms are especially well suited to diagnosis tasks because historical patient records typically include a confirmed outcome (diagnosis) that can serve as a label for training. Commonly applied algorithms in this space include Logistic Regression, Support Vector Machines, k Nearest Neighbors, Naive Bayes, Decision Trees, Random Forest, and various forms of Artificial Neural Networks.</w:t>
+      </w:r>
+    </w:p>
+    <w:p>
+      <w:pPr>
+        <w:spacing w:after="200" w:line="480" w:lineRule="auto"/>
+        <w:jc w:val="both"/>
+        <w:rPr>
+          <w:rFonts w:hint="default" w:ascii="Times New Roman" w:hAnsi="Times New Roman" w:cs="Times New Roman"/>
+          <w:color w:val="auto"/>
+          <w:sz w:val="24"/>
+          <w:szCs w:val="24"/>
+        </w:rPr>
+      </w:pPr>
+      <w:r>
+        <w:rPr>
+          <w:rFonts w:hint="default" w:ascii="Times New Roman" w:hAnsi="Times New Roman" w:cs="Times New Roman"/>
+          <w:color w:val="auto"/>
+          <w:sz w:val="24"/>
+          <w:szCs w:val="24"/>
+        </w:rPr>
+        <w:t>Across this literature, ensemble methods in general, and Random Forest in particular, are frequently highlighted for their favourable balance of accuracy, robustness to noisy or missing data, and interpretability through feature importance scores, properties that are valuable in a clinical setting where a black box prediction is of limited practical use to a physician.</w:t>
+      </w:r>
+    </w:p>
+    <w:p>
+      <w:pPr>
+        <w:pStyle w:val="3"/>
+        <w:bidi w:val="0"/>
+        <w:rPr>
+          <w:rFonts w:hint="default"/>
+        </w:rPr>
+      </w:pPr>
+      <w:bookmarkStart w:id="12" w:name="_Toc21063"/>
+      <w:r>
+        <w:rPr>
+          <w:rFonts w:hint="default"/>
+        </w:rPr>
+        <w:t>2.3 Theoretical Framework: From Decision Trees to Random Forest</w:t>
+      </w:r>
+      <w:bookmarkEnd w:id="12"/>
+    </w:p>
+    <w:p>
+      <w:pPr>
+        <w:spacing w:after="200" w:line="480" w:lineRule="auto"/>
+        <w:jc w:val="both"/>
+        <w:rPr>
+          <w:rFonts w:hint="default" w:ascii="Times New Roman" w:hAnsi="Times New Roman" w:cs="Times New Roman"/>
+          <w:color w:val="auto"/>
+          <w:sz w:val="24"/>
+          <w:szCs w:val="24"/>
+        </w:rPr>
+      </w:pPr>
+      <w:r>
+        <w:rPr>
+          <w:rFonts w:hint="default" w:ascii="Times New Roman" w:hAnsi="Times New Roman" w:cs="Times New Roman"/>
+          <w:color w:val="auto"/>
+          <w:sz w:val="24"/>
+          <w:szCs w:val="24"/>
+        </w:rPr>
+        <w:t>A decision tree is a model that splits data recursively based on attribute values in order to arrive at a prediction, following a structure that resembles a flowchart. While decision trees are easy to interpret, a single tree tends to overfit the training data and can be highly sensitive to small changes in the dataset, limiting its ability to generalize to unseen patients.</w:t>
+      </w:r>
+    </w:p>
+    <w:p>
+      <w:pPr>
+        <w:spacing w:after="200" w:line="480" w:lineRule="auto"/>
+        <w:jc w:val="both"/>
+        <w:rPr>
+          <w:rFonts w:hint="default" w:ascii="Times New Roman" w:hAnsi="Times New Roman" w:cs="Times New Roman"/>
+          <w:color w:val="auto"/>
+          <w:sz w:val="24"/>
+          <w:szCs w:val="24"/>
+        </w:rPr>
+      </w:pPr>
+      <w:r>
+        <w:rPr>
+          <w:rFonts w:hint="default" w:ascii="Times New Roman" w:hAnsi="Times New Roman" w:cs="Times New Roman"/>
+          <w:color w:val="auto"/>
+          <w:sz w:val="24"/>
+          <w:szCs w:val="24"/>
+        </w:rPr>
+        <w:t>Random Forest, introduced by Breiman (2001), addresses this weakness through an ensemble approach known as bagging, short for bootstrap aggregating. Multiple decision trees are trained on different random subsets of the training data and, at each split, only a random subset of attributes is considered. The final prediction is obtained by aggregating the outputs of all individual trees, typically through majority voting for classification tasks. As Breiman (2001) demonstrated, this process reduces variance, improves generalization to unseen data, and provides a natural measure of attribute importance based on how much each attribute contributes to reducing impurity across all trees in the forest. These theoretical properties directly motivate the choice of Random Forest for this study.</w:t>
+      </w:r>
+    </w:p>
+    <w:p>
+      <w:pPr>
+        <w:spacing w:after="200" w:line="480" w:lineRule="auto"/>
+        <w:jc w:val="both"/>
+        <w:rPr>
+          <w:rFonts w:hint="default" w:ascii="Times New Roman" w:hAnsi="Times New Roman" w:cs="Times New Roman"/>
+          <w:color w:val="auto"/>
+          <w:sz w:val="24"/>
+          <w:szCs w:val="24"/>
+        </w:rPr>
+      </w:pPr>
+      <w:r>
+        <w:rPr>
+          <w:rFonts w:hint="default" w:ascii="Times New Roman" w:hAnsi="Times New Roman" w:cs="Times New Roman"/>
+          <w:color w:val="auto"/>
+          <w:sz w:val="24"/>
+          <w:szCs w:val="24"/>
+        </w:rPr>
+        <w:t>Figure 2.1 illustrates this process as it applies to the system built in this study. Training data drawn from patient records is repeatedly resampled into bootstrap samples; each sample trains one decision tree, and each tree is additionally restricted to a random subset of the thirteen clinical attributes at every split, which keeps the individual trees from all learning the same patterns. Once all trees are trained, a new patient</w:t>
+      </w:r>
+      <w:r>
+        <w:rPr>
+          <w:rFonts w:hint="default" w:ascii="Times New Roman" w:hAnsi="Times New Roman" w:cs="Times New Roman"/>
+          <w:color w:val="auto"/>
+          <w:sz w:val="24"/>
+          <w:szCs w:val="24"/>
+          <w:lang w:val="en-US"/>
+        </w:rPr>
+        <w:t>’</w:t>
+      </w:r>
+      <w:r>
+        <w:rPr>
+          <w:rFonts w:hint="default" w:ascii="Times New Roman" w:hAnsi="Times New Roman" w:cs="Times New Roman"/>
+          <w:color w:val="auto"/>
+          <w:sz w:val="24"/>
+          <w:szCs w:val="24"/>
+        </w:rPr>
+        <w:t>s attributes are passed through every tree in the forest, and the trees vote; the proportion of trees voting for disease becomes the model</w:t>
+      </w:r>
+      <w:r>
+        <w:rPr>
+          <w:rFonts w:hint="default" w:ascii="Times New Roman" w:hAnsi="Times New Roman" w:cs="Times New Roman"/>
+          <w:color w:val="auto"/>
+          <w:sz w:val="24"/>
+          <w:szCs w:val="24"/>
+          <w:lang w:val="en-US"/>
+        </w:rPr>
+        <w:t>’</w:t>
+      </w:r>
+      <w:r>
+        <w:rPr>
+          <w:rFonts w:hint="default" w:ascii="Times New Roman" w:hAnsi="Times New Roman" w:cs="Times New Roman"/>
+          <w:color w:val="auto"/>
+          <w:sz w:val="24"/>
+          <w:szCs w:val="24"/>
+        </w:rPr>
+        <w:t>s predicted probability, and a majority vote above 50% becomes the final diagnosis. This same structure, once trained, is what Appendix B implements in code and what Chapter Four evaluates.</w:t>
+      </w:r>
+    </w:p>
+    <w:p>
+      <w:pPr>
+        <w:keepNext w:val="0"/>
+        <w:keepLines w:val="0"/>
+        <w:pageBreakBefore w:val="0"/>
+        <w:widowControl/>
+        <w:kinsoku/>
+        <w:wordWrap/>
+        <w:overflowPunct/>
+        <w:topLinePunct w:val="0"/>
+        <w:autoSpaceDE/>
+        <w:autoSpaceDN/>
+        <w:bidi w:val="0"/>
+        <w:adjustRightInd/>
+        <w:snapToGrid/>
+        <w:spacing w:line="480" w:lineRule="auto"/>
+        <w:jc w:val="both"/>
+        <w:textAlignment w:val="auto"/>
+        <w:rPr>
+          <w:rFonts w:hint="default"/>
+          <w:lang w:val="en-US"/>
+        </w:rPr>
+      </w:pPr>
+      <w:r>
+        <w:rPr>
+          <w:rFonts w:hint="default"/>
+          <w:lang w:val="en-US"/>
+        </w:rPr>
+        <w:drawing>
+          <wp:inline distT="0" distB="0" distL="114300" distR="114300">
+            <wp:extent cx="5928995" cy="3946525"/>
+            <wp:effectExtent l="0" t="0" r="1905" b="3175"/>
+            <wp:docPr id="5" name="Picture 5" descr="conceptual structure"/>
+            <wp:cNvGraphicFramePr>
+              <a:graphicFrameLocks xmlns:a="http://schemas.openxmlformats.org/drawingml/2006/main" noChangeAspect="1"/>
+            </wp:cNvGraphicFramePr>
+            <a:graphic xmlns:a="http://schemas.openxmlformats.org/drawingml/2006/main">
+              <a:graphicData uri="http://schemas.openxmlformats.org/drawingml/2006/picture">
+                <pic:pic xmlns:pic="http://schemas.openxmlformats.org/drawingml/2006/picture">
+                  <pic:nvPicPr>
+                    <pic:cNvPr id="5" name="Picture 5" descr="conceptual structure"/>
+                    <pic:cNvPicPr>
+                      <a:picLocks noChangeAspect="1"/>
+                    </pic:cNvPicPr>
+                  </pic:nvPicPr>
+                  <pic:blipFill>
+                    <a:blip r:embed="rId6"/>
+                    <a:stretch>
+                      <a:fillRect/>
+                    </a:stretch>
+                  </pic:blipFill>
+                  <pic:spPr>
+                    <a:xfrm>
+                      <a:off x="0" y="0"/>
+                      <a:ext cx="5928995" cy="3946525"/>
+                    </a:xfrm>
+                    <a:prstGeom prst="rect">
+                      <a:avLst/>
+                    </a:prstGeom>
+                  </pic:spPr>
+                </pic:pic>
+              </a:graphicData>
+            </a:graphic>
+          </wp:inline>
+        </w:drawing>
+      </w:r>
+    </w:p>
+    <w:p>
+      <w:pPr>
+        <w:keepNext w:val="0"/>
+        <w:keepLines w:val="0"/>
+        <w:pageBreakBefore w:val="0"/>
+        <w:widowControl/>
+        <w:kinsoku/>
+        <w:wordWrap/>
+        <w:overflowPunct/>
+        <w:topLinePunct w:val="0"/>
+        <w:autoSpaceDE/>
+        <w:autoSpaceDN/>
+        <w:bidi w:val="0"/>
+        <w:adjustRightInd/>
+        <w:snapToGrid/>
+        <w:spacing w:after="80" w:line="480" w:lineRule="auto"/>
+        <w:jc w:val="center"/>
+        <w:textAlignment w:val="auto"/>
+        <w:rPr>
+          <w:rFonts w:hint="default"/>
+        </w:rPr>
+      </w:pPr>
+      <w:r>
+        <w:rPr>
+          <w:rFonts w:hint="default" w:ascii="Times New Roman" w:hAnsi="Times New Roman" w:cs="Times New Roman"/>
+          <w:i/>
+          <w:iCs/>
+          <w:sz w:val="24"/>
+          <w:szCs w:val="24"/>
+        </w:rPr>
+        <w:t>Figure 2.1: Conceptual model of the Random Forest algorithm as applied in this study</w:t>
+      </w:r>
+    </w:p>
+    <w:p>
+      <w:pPr>
+        <w:pStyle w:val="3"/>
+        <w:bidi w:val="0"/>
+        <w:rPr>
+          <w:rFonts w:hint="default"/>
+        </w:rPr>
+      </w:pPr>
+      <w:bookmarkStart w:id="13" w:name="_Toc19755"/>
+      <w:r>
+        <w:rPr>
+          <w:rFonts w:hint="default"/>
+        </w:rPr>
+        <w:t>2.4 Review of Related Works</w:t>
+      </w:r>
+      <w:bookmarkEnd w:id="13"/>
+    </w:p>
+    <w:p>
+      <w:pPr>
+        <w:spacing w:after="200" w:line="480" w:lineRule="auto"/>
+        <w:jc w:val="both"/>
+        <w:rPr>
+          <w:rFonts w:hint="default" w:ascii="Times New Roman" w:hAnsi="Times New Roman" w:cs="Times New Roman"/>
+          <w:color w:val="auto"/>
+          <w:sz w:val="24"/>
+          <w:szCs w:val="24"/>
+        </w:rPr>
+      </w:pPr>
+      <w:r>
+        <w:rPr>
+          <w:rFonts w:hint="default" w:ascii="Times New Roman" w:hAnsi="Times New Roman" w:cs="Times New Roman"/>
+          <w:color w:val="auto"/>
+          <w:sz w:val="24"/>
+          <w:szCs w:val="24"/>
+        </w:rPr>
+        <w:t>Numerous studies have applied machine learning algorithms to heart disease prediction using the Cleveland Heart Disease dataset or related clinical datasets. Singh et al. (2017) applied Random Forest directly to the Cleveland dataset, training on 303 instances and validating accuracy through 10 fold cross validation, and reported an accuracy of 85.81%, attributing this performance to Random Forest's ability to exploit the non linear tendencies present in the data.</w:t>
+      </w:r>
+    </w:p>
+    <w:p>
+      <w:pPr>
+        <w:spacing w:after="200" w:line="480" w:lineRule="auto"/>
+        <w:jc w:val="both"/>
+        <w:rPr>
+          <w:rFonts w:hint="default" w:ascii="Times New Roman" w:hAnsi="Times New Roman" w:cs="Times New Roman"/>
+          <w:color w:val="auto"/>
+          <w:sz w:val="24"/>
+          <w:szCs w:val="24"/>
+        </w:rPr>
+      </w:pPr>
+      <w:r>
+        <w:rPr>
+          <w:rFonts w:hint="default" w:ascii="Times New Roman" w:hAnsi="Times New Roman" w:cs="Times New Roman"/>
+          <w:color w:val="auto"/>
+          <w:sz w:val="24"/>
+          <w:szCs w:val="24"/>
+        </w:rPr>
+        <w:t>Gavhane et al. (2018) compared several machine learning approaches, including a Multilayer Perceptron model, for heart disease prediction, framing the problem within the broader context of using machine learning to support earlier and more accessible diagnosis. Katarya and Srinivas (2020) similarly evaluated multiple machine learning models for early stage heart disease prediction, and found Random Forest to be among the consistently strong performers relative to alternative classifiers.</w:t>
+      </w:r>
+    </w:p>
+    <w:p>
+      <w:pPr>
+        <w:spacing w:after="200" w:line="480" w:lineRule="auto"/>
+        <w:jc w:val="both"/>
+        <w:rPr>
+          <w:rFonts w:hint="default" w:ascii="Times New Roman" w:hAnsi="Times New Roman" w:cs="Times New Roman"/>
+          <w:color w:val="auto"/>
+          <w:sz w:val="24"/>
+          <w:szCs w:val="24"/>
+        </w:rPr>
+      </w:pPr>
+      <w:r>
+        <w:rPr>
+          <w:rFonts w:hint="default" w:ascii="Times New Roman" w:hAnsi="Times New Roman" w:cs="Times New Roman"/>
+          <w:color w:val="auto"/>
+          <w:sz w:val="24"/>
+          <w:szCs w:val="24"/>
+        </w:rPr>
+        <w:t>Beyond direct applications to the Cleveland dataset, Random Forest has also been validated in adjacent cardiac prediction tasks. Masetic and Subasi (2016) applied Random Forest to the detection of congestive heart failure using ECG signal features, reporting strong classification performance and reinforcing the algorithm's suitability for cardiac diagnostic tasks more broadly. Ramalingam et al. (2018), in a survey of machine learning techniques for heart disease prediction, similarly identified Random Forest and related ensemble methods as consistently competitive with, and often superior to, single model approaches such as plain Decision Trees or Naive Bayes classifiers.</w:t>
+      </w:r>
+    </w:p>
+    <w:p>
+      <w:pPr>
+        <w:spacing w:after="200" w:line="480" w:lineRule="auto"/>
+        <w:jc w:val="both"/>
+        <w:rPr>
+          <w:rFonts w:hint="default" w:ascii="Times New Roman" w:hAnsi="Times New Roman" w:cs="Times New Roman"/>
+          <w:color w:val="auto"/>
+          <w:sz w:val="24"/>
+          <w:szCs w:val="24"/>
+        </w:rPr>
+      </w:pPr>
+      <w:r>
+        <w:rPr>
+          <w:rFonts w:hint="default" w:ascii="Times New Roman" w:hAnsi="Times New Roman" w:cs="Times New Roman"/>
+          <w:color w:val="auto"/>
+          <w:sz w:val="24"/>
+          <w:szCs w:val="24"/>
+        </w:rPr>
+        <w:t>Broader comparative studies, evaluating Random Forest alongside a wider range of classifiers, reinforce this picture. Katarya and Meena (2021), comparing several machine learning techniques for heart disease prediction, and Dissanayake and Md Johar (2021), who additionally examined the effect of ten different feature selection techniques on classification accuracy using the Cleveland dataset, both found ensemble and tree based methods, including Random Forest, to be consistently among the strongest performers relative to Logistic Regression, Naive Bayes, and k Nearest Neighbors. Dissanayake and Md Johar (2021) further demonstrated that classification accuracy on the Cleveland dataset is sensitive to feature selection strategy, with backward feature selection yielding the strongest results in their experiments, a consideration that, while outside the scope of this study, is noted as a direction for future work in Chapter Five.</w:t>
+      </w:r>
+    </w:p>
+    <w:p>
+      <w:pPr>
+        <w:spacing w:after="200" w:line="480" w:lineRule="auto"/>
+        <w:jc w:val="both"/>
+        <w:rPr>
+          <w:rFonts w:hint="default" w:ascii="Times New Roman" w:hAnsi="Times New Roman" w:cs="Times New Roman"/>
+          <w:color w:val="auto"/>
+          <w:sz w:val="24"/>
+          <w:szCs w:val="24"/>
+        </w:rPr>
+      </w:pPr>
+      <w:r>
+        <w:rPr>
+          <w:rFonts w:hint="default" w:ascii="Times New Roman" w:hAnsi="Times New Roman" w:cs="Times New Roman"/>
+          <w:color w:val="auto"/>
+          <w:sz w:val="24"/>
+          <w:szCs w:val="24"/>
+        </w:rPr>
+        <w:t>Taken together, this body of work indicates that Random Forest accuracy on the Cleveland dataset or its close variants typically falls in the range of 80% to 90%, depending on pre processing choices, cross validation strategy, and the specific train and test split used, with reported accuracies as high as the mid 90s in studies that combine Random Forest with additional feature selection or optimization techniques. Chest pain type, thalassemia status, maximum heart rate achieved, and the number of major vessels are recurring themes among the attributes identified as most predictive in this literature, a pattern that is revisited in Chapter Four in light of the results obtained in this study.</w:t>
+      </w:r>
+    </w:p>
+    <w:p>
+      <w:pPr>
+        <w:pStyle w:val="3"/>
+        <w:bidi w:val="0"/>
+        <w:rPr>
+          <w:rFonts w:hint="default"/>
+        </w:rPr>
+      </w:pPr>
+      <w:bookmarkStart w:id="14" w:name="_Toc8724"/>
+      <w:r>
+        <w:rPr>
+          <w:rFonts w:hint="default"/>
+        </w:rPr>
+        <w:t>2.5 Tools for Model Development</w:t>
+      </w:r>
+      <w:bookmarkEnd w:id="14"/>
+    </w:p>
+    <w:p>
+      <w:pPr>
+        <w:spacing w:after="200" w:line="480" w:lineRule="auto"/>
+        <w:jc w:val="both"/>
+        <w:rPr>
+          <w:rFonts w:hint="default" w:ascii="Times New Roman" w:hAnsi="Times New Roman" w:cs="Times New Roman"/>
+          <w:color w:val="auto"/>
+          <w:sz w:val="24"/>
+          <w:szCs w:val="24"/>
+        </w:rPr>
+      </w:pPr>
+      <w:r>
+        <w:rPr>
+          <w:rFonts w:hint="default" w:ascii="Times New Roman" w:hAnsi="Times New Roman" w:cs="Times New Roman"/>
+          <w:color w:val="auto"/>
+          <w:sz w:val="24"/>
+          <w:szCs w:val="24"/>
+        </w:rPr>
+        <w:t>The predominant tooling for this class of research is the Python scientific computing ecosystem, particularly the scikit learn library (Pedregosa et al., 2011), which provides efficient, well tested implementations of Random Forest and related algorithms alongside supporting utilities for cross validation, hyperparameter search, and evaluation metrics. This preference is not merely a matter of convenience: scikit learn's Random Forest implementation exposes exactly the parameters that Section 3.6 tunes (the number of trees, tree depth, and the minimum samples required to split or form a leaf), and its built in feature importance calculation is what produces the values reported in Section 4.6, so the choice of tool and the study's methodology are directly linked rather than incidental. This study adopts the same tooling, both for consistency with the broader literature reviewed above and for the practical benefit of a mature, actively maintained library whose behaviour is well documented and independently verifiable by other researchers.</w:t>
+      </w:r>
+    </w:p>
+    <w:p>
+      <w:pPr>
+        <w:pStyle w:val="3"/>
+        <w:bidi w:val="0"/>
+        <w:rPr>
+          <w:rFonts w:hint="default"/>
+        </w:rPr>
+      </w:pPr>
+      <w:bookmarkStart w:id="15" w:name="_Toc8847"/>
+      <w:r>
+        <w:rPr>
+          <w:rFonts w:hint="default"/>
+        </w:rPr>
+        <w:t>2.6 Identified Gaps</w:t>
+      </w:r>
+      <w:bookmarkEnd w:id="15"/>
+    </w:p>
+    <w:p>
+      <w:pPr>
+        <w:spacing w:after="200" w:line="480" w:lineRule="auto"/>
+        <w:jc w:val="both"/>
+        <w:rPr>
+          <w:rFonts w:hint="default" w:ascii="Times New Roman" w:hAnsi="Times New Roman" w:cs="Times New Roman"/>
+          <w:color w:val="auto"/>
+          <w:sz w:val="24"/>
+          <w:szCs w:val="24"/>
+        </w:rPr>
+      </w:pPr>
+      <w:r>
+        <w:rPr>
+          <w:rFonts w:hint="default" w:ascii="Times New Roman" w:hAnsi="Times New Roman" w:cs="Times New Roman"/>
+          <w:color w:val="auto"/>
+          <w:sz w:val="24"/>
+          <w:szCs w:val="24"/>
+        </w:rPr>
+        <w:t>While many existing studies report model accuracy, a smaller proportion document the full pipeline from raw data cleaning through to a usable prediction interface, and fewer still make the hyperparameter search process fully explicit and reproducible. This is a genuine gap rather than a minor omission: a reader who is told only that a study achieved 86% accuracy has no way to reproduce that figure, check whether it depended on a favourable train and test split, or reuse the resulting model, whereas the pipeline documented in Chapter Three and the appendices of this study can be rerun from the raw data to the same result.</w:t>
+      </w:r>
+    </w:p>
+    <w:p>
+      <w:pPr>
+        <w:spacing w:after="200" w:line="480" w:lineRule="auto"/>
+        <w:jc w:val="both"/>
+        <w:rPr>
+          <w:rFonts w:hint="default" w:ascii="Times New Roman" w:hAnsi="Times New Roman" w:cs="Times New Roman"/>
+          <w:color w:val="auto"/>
+          <w:sz w:val="24"/>
+          <w:szCs w:val="24"/>
+        </w:rPr>
+      </w:pPr>
+      <w:r>
+        <w:rPr>
+          <w:rFonts w:hint="default" w:ascii="Times New Roman" w:hAnsi="Times New Roman" w:cs="Times New Roman"/>
+          <w:color w:val="auto"/>
+          <w:sz w:val="24"/>
+          <w:szCs w:val="24"/>
+        </w:rPr>
+        <w:t>Some studies also report accuracy as the sole evaluation metric, which can be misleading in a diagnostic context where the cost of a false negative, a missed diagnosis, differs substantially from the cost of a false positive, an unnecessary further investigation. A model can achieve a superficially strong accuracy figure by performing well on the majority class while quietly missing a meaningful share of true disease cases, and accuracy alone would not reveal this.</w:t>
+      </w:r>
+    </w:p>
+    <w:p>
+      <w:pPr>
+        <w:pStyle w:val="22"/>
+        <w:keepNext w:val="0"/>
+        <w:keepLines w:val="0"/>
+        <w:pageBreakBefore w:val="0"/>
+        <w:widowControl/>
+        <w:numPr>
+          <w:numId w:val="0"/>
+        </w:numPr>
+        <w:kinsoku/>
+        <w:wordWrap/>
+        <w:overflowPunct/>
+        <w:topLinePunct w:val="0"/>
+        <w:autoSpaceDE/>
+        <w:autoSpaceDN/>
+        <w:bidi w:val="0"/>
+        <w:adjustRightInd/>
+        <w:snapToGrid/>
+        <w:spacing w:line="480" w:lineRule="auto"/>
+        <w:jc w:val="both"/>
+        <w:textAlignment w:val="auto"/>
+        <w:rPr>
+          <w:rFonts w:hint="default" w:ascii="Times New Roman" w:hAnsi="Times New Roman" w:cs="Times New Roman"/>
+          <w:b w:val="0"/>
+          <w:bCs w:val="0"/>
+          <w:color w:val="auto"/>
+          <w:sz w:val="24"/>
+          <w:szCs w:val="24"/>
+        </w:rPr>
+      </w:pPr>
+      <w:r>
+        <w:rPr>
+          <w:rFonts w:hint="default" w:ascii="Times New Roman" w:hAnsi="Times New Roman" w:cs="Times New Roman"/>
+          <w:color w:val="auto"/>
+          <w:sz w:val="24"/>
+          <w:szCs w:val="24"/>
+        </w:rPr>
+        <w:t>This study addresses both gaps directly. It presents a complete, end to end system, with every stage from data cleaning to prediction documented and reproduced in the appendices, and it reports precision, recall, F1 score, and ROC AUC alongside accuracy specifically so that the model's behaviour on the disease positive class, the one that matters most clinically, is visible rather than hidden inside a single aggregate number.</w:t>
+      </w:r>
+      <w:bookmarkStart w:id="16" w:name="_GoBack"/>
+      <w:bookmarkEnd w:id="16"/>
     </w:p>
     <w:sectPr>
       <w:headerReference r:id="rId3" w:type="default"/>

</xml_diff>